<commit_message>
Clerk letter: preempt the missing-index-number refusal ground under 22 NYCRR 202.5(d)(1) by tying it directly to the fact none has been assigned through no fault of Jeff's
Co-Authored-By: Claude Sonnet 5 <noreply@anthropic.com>
Claude-Session: https://claude.ai/code/session_01ScV4zYETA7REj3uJ3M3K7f
</commit_message>
<xml_diff>
--- a/case-files/bernecky/filing-pdfs/0-Cover-Letter-to-Clerk.docx
+++ b/case-files/bernecky/filing-pdfs/0-Cover-Letter-to-Clerk.docx
@@ -145,15 +145,15 @@
         <w:pStyle w:val="BodyText"/>
       </w:pPr>
       <w:r>
+        <w:t xml:space="preserve">A missing index number is one of the listed grounds, and I want to address it directly rather than wait for it to be raised. No index number appears on these documents because none has been assigned to this matter by any court office — not because I have failed to obtain or supply one. Your office has told me this results from my underlying conviction having occurred outside Monroe County. A number that the Court itself has not yet assigned is not a defect in my papers, and I do not believe 22 NYCRR 202.5(d)(1) was written to let that absence be held against the one party who has no ability to supply it.</w:t>
+      </w:r>
+    </w:p>
+    <w:p>
+      <w:pPr>
+        <w:pStyle w:val="BodyText"/>
+      </w:pPr>
+      <w:r>
         <w:t xml:space="preserve">I am asking that the enclosed documents be accepted for filing and entered into the case record, and that I be provided a receipt or file-stamped copy confirming that they have been filed. If your office declines to do so, I am asking that you state the specific statutory or rule-based ground for that refusal in writing, consistent with CPLR 2102(c).</w:t>
-      </w:r>
-    </w:p>
-    <w:p>
-      <w:pPr>
-        <w:pStyle w:val="BodyText"/>
-      </w:pPr>
-      <w:r>
-        <w:t xml:space="preserve">I have also been told by your office that no index or indictment number has been assigned to this matter, and that this results from my underlying conviction having occurred outside Monroe County. I am noting that here so the absence of a number on these documents is not mistaken for an omission on my part.</w:t>
       </w:r>
     </w:p>
     <w:p>

</xml_diff>